<commit_message>
feat(backend): migrate Core API to Java 17 + Spring Boot 3 with PostGIS and Swagger
</commit_message>
<xml_diff>
--- a/Tai_Lieu_Yeu_Cau_Va_Thiet_Ke_He_Thong_Canh_Bao_Sat_Lo_Dat.docx
+++ b/Tai_Lieu_Yeu_Cau_Va_Thiet_Ke_He_Thong_Canh_Bao_Sat_Lo_Dat.docx
@@ -429,14 +429,8 @@
         <w:tc>
           <w:tcPr/>
           <w:p>
-            <w:pPr>
-              <w:rPr/>
-            </w:pPr>
-            <w:r>
-              <w:rPr>
-                <w:rtl w:val="0"/>
-              </w:rPr>
-              <w:t xml:space="preserve">Thiết kế kiến trúc Microservices, xây dựng Core API (NestJS), quản lý Celery workers, xác thực JWT/RBAC và tích hợp Firebase Cloud Messaging.</w:t>
+            <w:r>
+              <w:t>Thiết kế kiến trúc Microservices, xây dựng Core API (Java Spring Boot 3), quản lý Celery workers, xác thực JWT/RBAC và tích hợp Firebase Cloud Messaging.</w:t>
             </w:r>
           </w:p>
         </w:tc>

</xml_diff>